<commit_message>
append document for agent
</commit_message>
<xml_diff>
--- a/AI技术分析/Agent/OpenClaw-源码解析--05-skills.docx
+++ b/AI技术分析/Agent/OpenClaw-源码解析--05-skills.docx
@@ -225,7 +225,21 @@
         <w:rPr>
           <w:rFonts w:ascii="Microsoft YaHei" w:hAnsi="Microsoft YaHei" w:hint="eastAsia"/>
         </w:rPr>
-        <w:t>kill的本质不是提示词增强，而是workflow的迁移。过去我们沉淀方法，靠的是文档、和老员工的口口相传，但这些东i都有一个共同的问题：他们能被阅读，但不能被执行。</w:t>
+        <w:t>kill的本质不是提示词增强，而是workflow的迁移。过去我们沉淀方法，靠的是文档、和老员工的口口相传，但这些东</w:t>
+      </w:r>
+      <w:proofErr w:type="spellStart"/>
+      <w:r>
+        <w:rPr>
+          <w:rFonts w:ascii="Microsoft YaHei" w:hAnsi="Microsoft YaHei" w:hint="eastAsia"/>
+        </w:rPr>
+        <w:t>i</w:t>
+      </w:r>
+      <w:proofErr w:type="spellEnd"/>
+      <w:r>
+        <w:rPr>
+          <w:rFonts w:ascii="Microsoft YaHei" w:hAnsi="Microsoft YaHei" w:hint="eastAsia"/>
+        </w:rPr>
+        <w:t>都有一个共同的问题：他们能被阅读，但不能被执行。</w:t>
       </w:r>
       <w:r>
         <w:rPr>
@@ -368,7 +382,21 @@
         <w:rPr>
           <w:rFonts w:ascii="Microsoft YaHei" w:hAnsi="Microsoft YaHei" w:hint="eastAsia"/>
         </w:rPr>
-        <w:t>与prompt不同的是skills更加工程化，skill一旦写好了，就被工具托管了。工具会在合适的时候自动调用它：当你提交PULL REQUEST，或者主动发起安全检查时，对应skill就会被自动加载、执行。并且，当前几乎每个基础模型/工具都支持skills，这意味着，一个写好的skill可以在不同的平台间复用，今天在claude code用的代码审核skill，明天切换到Cursor、OpenClaw同样生效。</w:t>
+        <w:t>与prompt不同的是skills更加工程化，skill一旦写好了，就被工具托管了。工具会在合适的时候自动调用它：当你提交PULL REQUEST，或者主动发起安全检查时，对应skill就会被自动加载、执行。并且，当前几乎每个基础模型/工具都支持skills，这意味着，一个写好的skill可以在不同的平台间复用，今天在</w:t>
+      </w:r>
+      <w:proofErr w:type="spellStart"/>
+      <w:r>
+        <w:rPr>
+          <w:rFonts w:ascii="Microsoft YaHei" w:hAnsi="Microsoft YaHei" w:hint="eastAsia"/>
+        </w:rPr>
+        <w:t>claude</w:t>
+      </w:r>
+      <w:proofErr w:type="spellEnd"/>
+      <w:r>
+        <w:rPr>
+          <w:rFonts w:ascii="Microsoft YaHei" w:hAnsi="Microsoft YaHei" w:hint="eastAsia"/>
+        </w:rPr>
+        <w:t xml:space="preserve"> code用的代码审核skill，明天切换到Cursor、OpenClaw同样生效。</w:t>
       </w:r>
     </w:p>
     <w:p>
@@ -1924,7 +1952,21 @@
         <w:rPr>
           <w:rFonts w:ascii="Microsoft YaHei" w:hAnsi="Microsoft YaHei" w:hint="eastAsia"/>
         </w:rPr>
-        <w:t>在展开细节之前，先从全局视角，介绍一下skills的系统架构，openclaw skills子系统由四个层次组成：</w:t>
+        <w:t>在展开细节之前，先从全局视角，介绍一下skills的系统架构，</w:t>
+      </w:r>
+      <w:proofErr w:type="spellStart"/>
+      <w:r>
+        <w:rPr>
+          <w:rFonts w:ascii="Microsoft YaHei" w:hAnsi="Microsoft YaHei" w:hint="eastAsia"/>
+        </w:rPr>
+        <w:t>openclaw</w:t>
+      </w:r>
+      <w:proofErr w:type="spellEnd"/>
+      <w:r>
+        <w:rPr>
+          <w:rFonts w:ascii="Microsoft YaHei" w:hAnsi="Microsoft YaHei" w:hint="eastAsia"/>
+        </w:rPr>
+        <w:t xml:space="preserve"> skills子系统由四个层次组成：</w:t>
       </w:r>
     </w:p>
     <w:p>
@@ -2165,7 +2207,23 @@
         <w:rPr>
           <w:rFonts w:ascii="Microsoft YaHei" w:hAnsi="Microsoft YaHei" w:hint="eastAsia"/>
         </w:rPr>
-        <w:t>通过Map&lt;name,skill&gt;，后写入覆盖先写入机制实现。</w:t>
+        <w:t>通过Map&lt;</w:t>
+      </w:r>
+      <w:proofErr w:type="spellStart"/>
+      <w:proofErr w:type="gramStart"/>
+      <w:r>
+        <w:rPr>
+          <w:rFonts w:ascii="Microsoft YaHei" w:hAnsi="Microsoft YaHei" w:hint="eastAsia"/>
+        </w:rPr>
+        <w:t>name,skill</w:t>
+      </w:r>
+      <w:proofErr w:type="spellEnd"/>
+      <w:proofErr w:type="gramEnd"/>
+      <w:r>
+        <w:rPr>
+          <w:rFonts w:ascii="Microsoft YaHei" w:hAnsi="Microsoft YaHei" w:hint="eastAsia"/>
+        </w:rPr>
+        <w:t>&gt;，后写入覆盖先写入机制实现。</w:t>
       </w:r>
     </w:p>
     <w:p>
@@ -2306,15 +2364,57 @@
         <w:rPr>
           <w:rFonts w:ascii="Microsoft YaHei" w:hAnsi="Microsoft YaHei" w:hint="eastAsia"/>
         </w:rPr>
-        <w:t>你日常开发，个人习惯用“summarizes-changes”这个技能来生成commit信息。你把他放在~/.openclaw/skills/里，一直用的非常顺手。有一天，你接手一个开源项目，这个项目对commit格式要求非常严格，必须用特定模板。你不想改掉自己全局commit消息的格式，但在这个项目里必须又要遵守它的规范。这个时候，我们就需要新建一个agent来处理这个事情，同时把这个skills复制到新建的Agent的工作区内，</w:t>
-      </w:r>
-      <w:r>
-        <w:rPr>
-          <w:rFonts w:ascii="Microsoft YaHei" w:hAnsi="Microsoft YaHei" w:hint="eastAsia"/>
-          <w:b/>
-          <w:bCs/>
-        </w:rPr>
-        <w:t>在该项目的根目录下创建.openclaw/workspace/skills/summarize-changes</w:t>
+        <w:t>你日常开发，个人习惯用“summarizes-changes”这个技能来生成commit信息。你把他放在~</w:t>
+      </w:r>
+      <w:proofErr w:type="gramStart"/>
+      <w:r>
+        <w:rPr>
+          <w:rFonts w:ascii="Microsoft YaHei" w:hAnsi="Microsoft YaHei" w:hint="eastAsia"/>
+        </w:rPr>
+        <w:t>/.</w:t>
+      </w:r>
+      <w:proofErr w:type="spellStart"/>
+      <w:r>
+        <w:rPr>
+          <w:rFonts w:ascii="Microsoft YaHei" w:hAnsi="Microsoft YaHei" w:hint="eastAsia"/>
+        </w:rPr>
+        <w:t>openclaw</w:t>
+      </w:r>
+      <w:proofErr w:type="spellEnd"/>
+      <w:proofErr w:type="gramEnd"/>
+      <w:r>
+        <w:rPr>
+          <w:rFonts w:ascii="Microsoft YaHei" w:hAnsi="Microsoft YaHei" w:hint="eastAsia"/>
+        </w:rPr>
+        <w:t>/skills/里，一直用的非常顺手。有一天，你接手一个开源项目，这个项目对commit格式要求非常严格，必须用特定模板。你不想改掉自己全局commit消息的格式，但在这个项目里必须又要遵守它的规范。这个时候，我们就需要新建一个agent来处理这个事情，同时把这个skills复制到新建的Agent的工作区内，</w:t>
+      </w:r>
+      <w:proofErr w:type="gramStart"/>
+      <w:r>
+        <w:rPr>
+          <w:rFonts w:ascii="Microsoft YaHei" w:hAnsi="Microsoft YaHei" w:hint="eastAsia"/>
+          <w:b/>
+          <w:bCs/>
+        </w:rPr>
+        <w:t>在该项目的根目录下创建.</w:t>
+      </w:r>
+      <w:proofErr w:type="spellStart"/>
+      <w:r>
+        <w:rPr>
+          <w:rFonts w:ascii="Microsoft YaHei" w:hAnsi="Microsoft YaHei" w:hint="eastAsia"/>
+          <w:b/>
+          <w:bCs/>
+        </w:rPr>
+        <w:t>openclaw</w:t>
+      </w:r>
+      <w:proofErr w:type="spellEnd"/>
+      <w:proofErr w:type="gramEnd"/>
+      <w:r>
+        <w:rPr>
+          <w:rFonts w:ascii="Microsoft YaHei" w:hAnsi="Microsoft YaHei" w:hint="eastAsia"/>
+          <w:b/>
+          <w:bCs/>
+        </w:rPr>
+        <w:t>/workspace/skills/summarize-changes</w:t>
       </w:r>
       <w:r>
         <w:rPr>
@@ -2545,7 +2645,21 @@
         <w:rPr>
           <w:rFonts w:ascii="Microsoft YaHei" w:hAnsi="Microsoft YaHei" w:hint="eastAsia"/>
         </w:rPr>
-        <w:t>Webhooks支持：github PR提交、Slack消息等实现真正的自动化工作流</w:t>
+        <w:t>Webhooks支持：</w:t>
+      </w:r>
+      <w:proofErr w:type="spellStart"/>
+      <w:r>
+        <w:rPr>
+          <w:rFonts w:ascii="Microsoft YaHei" w:hAnsi="Microsoft YaHei" w:hint="eastAsia"/>
+        </w:rPr>
+        <w:t>github</w:t>
+      </w:r>
+      <w:proofErr w:type="spellEnd"/>
+      <w:r>
+        <w:rPr>
+          <w:rFonts w:ascii="Microsoft YaHei" w:hAnsi="Microsoft YaHei" w:hint="eastAsia"/>
+        </w:rPr>
+        <w:t xml:space="preserve"> PR提交、Slack消息等实现真正的自动化工作流</w:t>
       </w:r>
       <w:r>
         <w:rPr>
@@ -2568,7 +2682,35 @@
         <w:rPr>
           <w:rFonts w:ascii="Microsoft YaHei" w:hAnsi="Microsoft YaHei" w:hint="eastAsia"/>
         </w:rPr>
-        <w:t>（语义触发 -&gt; skill指令 -&gt;Cron定时 -&gt; Webhook事件 -&gt; 共用loadSkillEntries -） filterSkillEntries -&gt; 注入prompt）</w:t>
+        <w:t>（语义触发 -&gt; skill指令 -&gt;Cron定时 -&gt; Webhook事件 -&gt; 共用</w:t>
+      </w:r>
+      <w:proofErr w:type="spellStart"/>
+      <w:r>
+        <w:rPr>
+          <w:rFonts w:ascii="Microsoft YaHei" w:hAnsi="Microsoft YaHei" w:hint="eastAsia"/>
+        </w:rPr>
+        <w:t>loadSkillEntries</w:t>
+      </w:r>
+      <w:proofErr w:type="spellEnd"/>
+      <w:r>
+        <w:rPr>
+          <w:rFonts w:ascii="Microsoft YaHei" w:hAnsi="Microsoft YaHei" w:hint="eastAsia"/>
+        </w:rPr>
+        <w:t xml:space="preserve"> -） </w:t>
+      </w:r>
+      <w:proofErr w:type="spellStart"/>
+      <w:r>
+        <w:rPr>
+          <w:rFonts w:ascii="Microsoft YaHei" w:hAnsi="Microsoft YaHei" w:hint="eastAsia"/>
+        </w:rPr>
+        <w:t>filterSkillEntries</w:t>
+      </w:r>
+      <w:proofErr w:type="spellEnd"/>
+      <w:r>
+        <w:rPr>
+          <w:rFonts w:ascii="Microsoft YaHei" w:hAnsi="Microsoft YaHei" w:hint="eastAsia"/>
+        </w:rPr>
+        <w:t xml:space="preserve"> -&gt; 注入prompt）</w:t>
       </w:r>
       <w:r>
         <w:rPr>
@@ -2642,7 +2784,21 @@
           <w:rFonts w:ascii="Microsoft YaHei" w:hAnsi="Microsoft YaHei" w:hint="eastAsia"/>
         </w:rPr>
         <w:lastRenderedPageBreak/>
-        <w:t>这两个参数对应源码中的SkillInvocationPolicy结构，可以精细控制Skill的触发权限。</w:t>
+        <w:t>这两个参数对应源码中的</w:t>
+      </w:r>
+      <w:proofErr w:type="spellStart"/>
+      <w:r>
+        <w:rPr>
+          <w:rFonts w:ascii="Microsoft YaHei" w:hAnsi="Microsoft YaHei" w:hint="eastAsia"/>
+        </w:rPr>
+        <w:t>SkillInvocationPolicy</w:t>
+      </w:r>
+      <w:proofErr w:type="spellEnd"/>
+      <w:r>
+        <w:rPr>
+          <w:rFonts w:ascii="Microsoft YaHei" w:hAnsi="Microsoft YaHei" w:hint="eastAsia"/>
+        </w:rPr>
+        <w:t>结构，可以精细控制Skill的触发权限。</w:t>
       </w:r>
     </w:p>
     <w:p>
@@ -2833,7 +2989,21 @@
         <w:rPr>
           <w:rFonts w:ascii="Microsoft YaHei" w:hAnsi="Microsoft YaHei" w:hint="eastAsia"/>
         </w:rPr>
-        <w:t>还有一个省token的小细节：compactSkillPaths函数会把/Users/alice/.bun/</w:t>
+        <w:t>还有一个省token的小细节：</w:t>
+      </w:r>
+      <w:proofErr w:type="spellStart"/>
+      <w:r>
+        <w:rPr>
+          <w:rFonts w:ascii="Microsoft YaHei" w:hAnsi="Microsoft YaHei" w:hint="eastAsia"/>
+        </w:rPr>
+        <w:t>compactSkillPaths</w:t>
+      </w:r>
+      <w:proofErr w:type="spellEnd"/>
+      <w:r>
+        <w:rPr>
+          <w:rFonts w:ascii="Microsoft YaHei" w:hAnsi="Microsoft YaHei" w:hint="eastAsia"/>
+        </w:rPr>
+        <w:t>函数会把/Users/alice/.bun/</w:t>
       </w:r>
       <w:r>
         <w:rPr>
@@ -2845,7 +3015,21 @@
         <w:rPr>
           <w:rFonts w:ascii="Microsoft YaHei" w:hAnsi="Microsoft YaHei" w:hint="eastAsia"/>
         </w:rPr>
-        <w:t>/skills/github/SKILL.md替换为~/.bun/</w:t>
+        <w:t>/skills/github/SKILL.md替换为~</w:t>
+      </w:r>
+      <w:proofErr w:type="gramStart"/>
+      <w:r>
+        <w:rPr>
+          <w:rFonts w:ascii="Microsoft YaHei" w:hAnsi="Microsoft YaHei" w:hint="eastAsia"/>
+        </w:rPr>
+        <w:t>/.bun</w:t>
+      </w:r>
+      <w:proofErr w:type="gramEnd"/>
+      <w:r>
+        <w:rPr>
+          <w:rFonts w:ascii="Microsoft YaHei" w:hAnsi="Microsoft YaHei" w:hint="eastAsia"/>
+        </w:rPr>
+        <w:t>/</w:t>
       </w:r>
       <w:r>
         <w:rPr>
@@ -2953,7 +3137,21 @@
         <w:rPr>
           <w:rFonts w:ascii="Microsoft YaHei" w:hAnsi="Microsoft YaHei" w:hint="eastAsia"/>
         </w:rPr>
-        <w:t>OpenClaw用Chokidar监听所有skill目录中*/SKILL.md文件。当修改了某个SKILL.md，监听器会在250ms去抖后触发版本递增，自动重建system prompt中的技能目录。整个过程无需重启，对正在进行的对话是</w:t>
+        <w:t>OpenClaw用</w:t>
+      </w:r>
+      <w:proofErr w:type="spellStart"/>
+      <w:r>
+        <w:rPr>
+          <w:rFonts w:ascii="Microsoft YaHei" w:hAnsi="Microsoft YaHei" w:hint="eastAsia"/>
+        </w:rPr>
+        <w:t>Chokidar</w:t>
+      </w:r>
+      <w:proofErr w:type="spellEnd"/>
+      <w:r>
+        <w:rPr>
+          <w:rFonts w:ascii="Microsoft YaHei" w:hAnsi="Microsoft YaHei" w:hint="eastAsia"/>
+        </w:rPr>
+        <w:t>监听所有skill目录中*/SKILL.md文件。当修改了某个SKILL.md，监听器会在250ms去抖后触发版本递增，自动重建system prompt中的技能目录。整个过程无需重启，对正在进行的对话是</w:t>
       </w:r>
       <w:r>
         <w:rPr>
@@ -4084,6 +4282,7 @@
           <w:rFonts w:ascii="Microsoft YaHei" w:hAnsi="Microsoft YaHei"/>
         </w:rPr>
       </w:pPr>
+      <w:proofErr w:type="gramStart"/>
       <w:r>
         <w:rPr>
           <w:rFonts w:ascii="Microsoft YaHei" w:hAnsi="Microsoft YaHei"/>
@@ -4096,6 +4295,7 @@
         </w:rPr>
         <w:t>kill不是一次性产品，上线后经常看看：</w:t>
       </w:r>
+      <w:proofErr w:type="gramEnd"/>
     </w:p>
     <w:p>
       <w:pPr>
@@ -4241,89 +4441,15 @@
       <w:pPr>
         <w:adjustRightInd w:val="0"/>
         <w:snapToGrid w:val="0"/>
-        <w:jc w:val="center"/>
-        <w:rPr>
-          <w:rFonts w:ascii="Microsoft YaHei" w:hAnsi="Microsoft YaHei"/>
-        </w:rPr>
-      </w:pPr>
-    </w:p>
-    <w:p>
-      <w:pPr>
-        <w:adjustRightInd w:val="0"/>
-        <w:snapToGrid w:val="0"/>
-        <w:jc w:val="left"/>
-        <w:rPr>
-          <w:rFonts w:ascii="Microsoft YaHei" w:hAnsi="Microsoft YaHei"/>
-        </w:rPr>
-      </w:pPr>
-      <w:hyperlink r:id="rId33" w:history="1">
-        <w:r>
-          <w:rPr>
-            <w:rStyle w:val="Hyperlink"/>
-            <w:rFonts w:ascii="Microsoft YaHei" w:hAnsi="Microsoft YaHei"/>
-          </w:rPr>
-          <w:t>https://claude.whaty.org/posts/Claude-code-source-analysis-handbook.html</w:t>
-        </w:r>
-      </w:hyperlink>
-    </w:p>
-    <w:p>
-      <w:pPr>
-        <w:adjustRightInd w:val="0"/>
-        <w:snapToGrid w:val="0"/>
-        <w:jc w:val="left"/>
-        <w:rPr>
-          <w:rFonts w:ascii="Microsoft YaHei" w:hAnsi="Microsoft YaHei"/>
-        </w:rPr>
-      </w:pPr>
-    </w:p>
-    <w:p>
-      <w:pPr>
-        <w:adjustRightInd w:val="0"/>
-        <w:snapToGrid w:val="0"/>
-        <w:jc w:val="left"/>
-        <w:rPr>
-          <w:rFonts w:ascii="Microsoft YaHei" w:hAnsi="Microsoft YaHei"/>
-        </w:rPr>
-      </w:pPr>
-      <w:hyperlink r:id="rId34" w:history="1">
-        <w:r>
-          <w:rPr>
-            <w:rStyle w:val="Hyperlink"/>
-            <w:rFonts w:ascii="Microsoft YaHei" w:hAnsi="Microsoft YaHei"/>
-          </w:rPr>
-          <w:t>https://mp.weixin.qq.com/s/JtECR8pMopRSec_FF3S20g</w:t>
-        </w:r>
-      </w:hyperlink>
-    </w:p>
-    <w:p>
-      <w:pPr>
-        <w:adjustRightInd w:val="0"/>
-        <w:snapToGrid w:val="0"/>
-        <w:jc w:val="left"/>
-        <w:rPr>
-          <w:rFonts w:ascii="Microsoft YaHei" w:hAnsi="Microsoft YaHei"/>
-        </w:rPr>
-      </w:pPr>
-    </w:p>
-    <w:p>
-      <w:pPr>
-        <w:adjustRightInd w:val="0"/>
-        <w:snapToGrid w:val="0"/>
-        <w:jc w:val="left"/>
-        <w:rPr>
-          <w:rFonts w:ascii="Microsoft YaHei" w:hAnsi="Microsoft YaHei"/>
-        </w:rPr>
-      </w:pPr>
-      <w:r>
-        <w:rPr>
-          <w:rFonts w:ascii="Microsoft YaHei" w:hAnsi="Microsoft YaHei"/>
-        </w:rPr>
-        <w:t>https://mp.weixin.qq.com/s/k2vjcm5ctSdCYXRDko9CZQ</w:t>
-      </w:r>
+        <w:jc w:val="left"/>
+        <w:rPr>
+          <w:rFonts w:ascii="Microsoft YaHei" w:hAnsi="Microsoft YaHei"/>
+        </w:rPr>
+      </w:pPr>
     </w:p>
     <w:sectPr>
-      <w:headerReference w:type="default" r:id="rId35"/>
-      <w:footerReference w:type="default" r:id="rId36"/>
+      <w:headerReference w:type="default" r:id="rId33"/>
+      <w:footerReference w:type="default" r:id="rId34"/>
       <w:pgSz w:w="11906" w:h="16838"/>
       <w:pgMar w:top="851" w:right="991" w:bottom="1440" w:left="993" w:header="510" w:footer="850" w:gutter="0"/>
       <w:cols w:space="425"/>

</xml_diff>